<commit_message>
docs(patent): add pro SVG+PNG diagrams; update docs to reference; regenerate .docx
</commit_message>
<xml_diff>
--- a/docs/patent/技术交底书-路由分级预取-成品.docx
+++ b/docs/patent/技术交底书-路由分级预取-成品.docx
@@ -47,7 +47,7 @@
     </w:p>
     <w:p>
       <w:r>
-        <w:t xml:space="preserve">现有单页/多页应用的路由切换受网络、设备与资源冷启动影响，首屏与二跳耗时大。传统预取多为静态或启发式，无法兼顾会话差异与实时网络波动；缺少带宽/CPU/存储等预算约束与可解释性。浏览器或CDN的投机预取/预渲染多不感知业务路由语义，不具备个体会话级精细化调度。</w:t>
+        <w:t xml:space="preserve">现有单页/多页应用的路由切换受网络、设备与资源冷启动影响，首屏与二跳耗时大。传统预取多为静态或启发式，无法兼顾会话差异与实时网络波动；缺少带宽/CPU/存储等预算与可解释性。浏览器或CDN的投机预取/预渲染多不感知业务路由语义，不具备个体会话级精细化调度。</w:t>
       </w:r>
     </w:p>
     <w:p>
@@ -86,7 +86,7 @@
         <w:pStyle w:val="Heading2"/>
       </w:pPr>
       <w:r>
-        <w:t xml:space="preserve">六、附图</w:t>
+        <w:t xml:space="preserve">六、附图（专业版）</w:t>
       </w:r>
     </w:p>
     <w:p>
@@ -101,7 +101,7 @@
       <w:r>
         <w:drawing>
           <wp:inline distT="0" distB="0" distL="0" distR="0">
-            <wp:extent cx="4953000" cy="3067050"/>
+            <wp:extent cx="5524500" cy="3429000"/>
             <wp:effectExtent t="0" r="0" b="0" l="0"/>
             <wp:docPr id="1" name="" descr="" title=""/>
             <wp:cNvGraphicFramePr>
@@ -126,7 +126,7 @@
                   <pic:spPr bwMode="auto">
                     <a:xfrm>
                       <a:off x="0" y="0"/>
-                      <a:ext cx="4953000" cy="3067050"/>
+                      <a:ext cx="5524500" cy="3429000"/>
                     </a:xfrm>
                     <a:prstGeom prst="rect">
                       <a:avLst/>
@@ -151,7 +151,7 @@
       <w:r>
         <w:drawing>
           <wp:inline distT="0" distB="0" distL="0" distR="0">
-            <wp:extent cx="4953000" cy="3067050"/>
+            <wp:extent cx="5524500" cy="3429000"/>
             <wp:effectExtent t="0" r="0" b="0" l="0"/>
             <wp:docPr id="1" name="" descr="" title=""/>
             <wp:cNvGraphicFramePr>
@@ -176,7 +176,7 @@
                   <pic:spPr bwMode="auto">
                     <a:xfrm>
                       <a:off x="0" y="0"/>
-                      <a:ext cx="4953000" cy="3067050"/>
+                      <a:ext cx="5524500" cy="3429000"/>
                     </a:xfrm>
                     <a:prstGeom prst="rect">
                       <a:avLst/>
@@ -201,7 +201,7 @@
       <w:r>
         <w:drawing>
           <wp:inline distT="0" distB="0" distL="0" distR="0">
-            <wp:extent cx="4953000" cy="3067050"/>
+            <wp:extent cx="5905500" cy="3657600"/>
             <wp:effectExtent t="0" r="0" b="0" l="0"/>
             <wp:docPr id="1" name="" descr="" title=""/>
             <wp:cNvGraphicFramePr>
@@ -226,7 +226,7 @@
                   <pic:spPr bwMode="auto">
                     <a:xfrm>
                       <a:off x="0" y="0"/>
-                      <a:ext cx="4953000" cy="3067050"/>
+                      <a:ext cx="5905500" cy="3657600"/>
                     </a:xfrm>
                     <a:prstGeom prst="rect">
                       <a:avLst/>
@@ -251,7 +251,7 @@
       <w:r>
         <w:drawing>
           <wp:inline distT="0" distB="0" distL="0" distR="0">
-            <wp:extent cx="4953000" cy="3067050"/>
+            <wp:extent cx="5334000" cy="3305175"/>
             <wp:effectExtent t="0" r="0" b="0" l="0"/>
             <wp:docPr id="1" name="" descr="" title=""/>
             <wp:cNvGraphicFramePr>
@@ -276,7 +276,7 @@
                   <pic:spPr bwMode="auto">
                     <a:xfrm>
                       <a:off x="0" y="0"/>
-                      <a:ext cx="4953000" cy="3067050"/>
+                      <a:ext cx="5334000" cy="3305175"/>
                     </a:xfrm>
                     <a:prstGeom prst="rect">
                       <a:avLst/>
@@ -301,7 +301,7 @@
       <w:r>
         <w:drawing>
           <wp:inline distT="0" distB="0" distL="0" distR="0">
-            <wp:extent cx="4953000" cy="3067050"/>
+            <wp:extent cx="5715000" cy="3543300"/>
             <wp:effectExtent t="0" r="0" b="0" l="0"/>
             <wp:docPr id="1" name="" descr="" title=""/>
             <wp:cNvGraphicFramePr>
@@ -326,7 +326,7 @@
                   <pic:spPr bwMode="auto">
                     <a:xfrm>
                       <a:off x="0" y="0"/>
-                      <a:ext cx="4953000" cy="3067050"/>
+                      <a:ext cx="5715000" cy="3543300"/>
                     </a:xfrm>
                     <a:prstGeom prst="rect">
                       <a:avLst/>

</xml_diff>

<commit_message>
docs(patent): add layered architecture diagram; switch docs and .docx to layered version
</commit_message>
<xml_diff>
--- a/docs/patent/技术交底书-路由分级预取-成品.docx
+++ b/docs/patent/技术交底书-路由分级预取-成品.docx
@@ -91,7 +91,7 @@
     </w:p>
     <w:p>
       <w:r>
-        <w:t xml:space="preserve">图1 系统架构图</w:t>
+        <w:t xml:space="preserve">图1 分层架构图</w:t>
       </w:r>
     </w:p>
     <w:p>
@@ -101,7 +101,7 @@
       <w:r>
         <w:drawing>
           <wp:inline distT="0" distB="0" distL="0" distR="0">
-            <wp:extent cx="5524500" cy="3429000"/>
+            <wp:extent cx="5715000" cy="3543300"/>
             <wp:effectExtent t="0" r="0" b="0" l="0"/>
             <wp:docPr id="1" name="" descr="" title=""/>
             <wp:cNvGraphicFramePr>
@@ -126,7 +126,7 @@
                   <pic:spPr bwMode="auto">
                     <a:xfrm>
                       <a:off x="0" y="0"/>
-                      <a:ext cx="5524500" cy="3429000"/>
+                      <a:ext cx="5715000" cy="3543300"/>
                     </a:xfrm>
                     <a:prstGeom prst="rect">
                       <a:avLst/>

</xml_diff>